<commit_message>
Added additional screenshots to the assignment document.
</commit_message>
<xml_diff>
--- a/paras_tomar_git_assignment.docx
+++ b/paras_tomar_git_assignment.docx
@@ -1449,9 +1449,20 @@
         </w:rPr>
         <w:t>Cherry pick 2</w:t>
       </w:r>
+    </w:p>
+    <w:p>
+      <w:pPr>
+        <w:pStyle w:val="ListParagraph"/>
+        <w:ind w:left="720"/>
+        <w:jc w:val="left"/>
+        <w:rPr>
+          <w:sz w:val="24"/>
+          <w:szCs w:val="24"/>
+        </w:rPr>
+      </w:pPr>
       <w:r>
         <w:drawing>
-          <wp:inline wp14:editId="5D29C339" wp14:anchorId="6BBA8994">
+          <wp:inline wp14:editId="795FB172" wp14:anchorId="6BBA8994">
             <wp:extent cx="5715000" cy="2085975"/>
             <wp:effectExtent l="0" t="0" r="0" b="0"/>
             <wp:docPr id="1922057388" name="drawing"/>
@@ -1481,6 +1492,92 @@
                     <a:xfrm>
                       <a:off x="0" y="0"/>
                       <a:ext cx="5715000" cy="2085975"/>
+                    </a:xfrm>
+                    <a:prstGeom prst="rect">
+                      <a:avLst/>
+                    </a:prstGeom>
+                  </pic:spPr>
+                </pic:pic>
+              </a:graphicData>
+            </a:graphic>
+          </wp:inline>
+        </w:drawing>
+      </w:r>
+    </w:p>
+    <w:p>
+      <w:pPr>
+        <w:pStyle w:val="ListParagraph"/>
+        <w:ind w:left="720"/>
+        <w:jc w:val="left"/>
+        <w:rPr>
+          <w:sz w:val="24"/>
+          <w:szCs w:val="24"/>
+        </w:rPr>
+      </w:pPr>
+    </w:p>
+    <w:p>
+      <w:pPr>
+        <w:pStyle w:val="Normal"/>
+        <w:ind w:left="0"/>
+        <w:jc w:val="left"/>
+        <w:rPr>
+          <w:sz w:val="24"/>
+          <w:szCs w:val="24"/>
+        </w:rPr>
+      </w:pPr>
+      <w:r>
+        <w:rPr>
+          <w:sz w:val="24"/>
+          <w:szCs w:val="24"/>
+        </w:rPr>
+        <w:t xml:space="preserve">       22. Git push </w:t>
+      </w:r>
+      <w:r>
+        <w:rPr>
+          <w:sz w:val="24"/>
+          <w:szCs w:val="24"/>
+        </w:rPr>
+        <w:t>command</w:t>
+      </w:r>
+      <w:r>
+        <w:rPr>
+          <w:sz w:val="24"/>
+          <w:szCs w:val="24"/>
+        </w:rPr>
+        <w:t xml:space="preserve"> </w:t>
+      </w:r>
+      <w:r>
+        <w:drawing>
+          <wp:inline wp14:editId="209DD37B" wp14:anchorId="16E2210D">
+            <wp:extent cx="5943600" cy="1333500"/>
+            <wp:effectExtent l="0" t="0" r="0" b="0"/>
+            <wp:docPr id="554881353" name="drawing"/>
+            <wp:cNvGraphicFramePr>
+              <a:graphicFrameLocks noChangeAspect="1"/>
+            </wp:cNvGraphicFramePr>
+            <a:graphic>
+              <a:graphicData xmlns:a="http://schemas.openxmlformats.org/drawingml/2006/main" uri="http://schemas.openxmlformats.org/drawingml/2006/picture">
+                <pic:pic xmlns:pic="http://schemas.openxmlformats.org/drawingml/2006/picture">
+                  <pic:nvPicPr>
+                    <pic:cNvPr id="554881353" name="Picture 554881353"/>
+                    <pic:cNvPicPr/>
+                  </pic:nvPicPr>
+                  <pic:blipFill>
+                    <a:blip xmlns:r="http://schemas.openxmlformats.org/officeDocument/2006/relationships" r:embed="rId1494163871">
+                      <a:extLst>
+                        <a:ext uri="{28A0092B-C50C-407E-A947-70E740481C1C}">
+                          <a14:useLocalDpi xmlns:a14="http://schemas.microsoft.com/office/drawing/2010/main"/>
+                        </a:ext>
+                      </a:extLst>
+                    </a:blip>
+                    <a:stretch>
+                      <a:fillRect/>
+                    </a:stretch>
+                  </pic:blipFill>
+                  <pic:spPr>
+                    <a:xfrm>
+                      <a:off x="0" y="0"/>
+                      <a:ext cx="5943600" cy="1333500"/>
                     </a:xfrm>
                     <a:prstGeom prst="rect">
                       <a:avLst/>

</xml_diff>